<commit_message>
Strip inline bolds from one-pager; remove em dashes across AMIA kit
- One-pager: removed all mid-sentence bold emphasis from body prose (kept
  structural hierarchy: headings, card names, ask label, timeline dates).
- Removed every em dash from the briefing, draft letter, and reply email;
  replaced with colons/semicolons/periods. Both rendered PDFs verified at 0.
- Regenerated briefing + letter PDFs and the letter .docx.

(The original outbound 2026-06-25-amia-norquist-email.md is left as-is: it is
the record of the message Craig already replied to.)

Co-Authored-By: Claude Opus 4.8 <noreply@anthropic.com>
</commit_message>
<xml_diff>
--- a/docs/outreach/2026-06-25-amia-medical-emoji-letter-DRAFT.docx
+++ b/docs/outreach/2026-06-25-amia-medical-emoji-letter-DRAFT.docx
@@ -63,7 +63,7 @@
         <w:pStyle w:val="BodyText"/>
       </w:pPr>
       <w:r>
-        <w:t xml:space="preserve">The American Medical Informatics Association (AMIA) writes to support the development and inclusion of a standardized set of medical emoji in the Unicode Standard. AMIA is the professional home for more than [5,500] biomedical and health informatics professionals — physicians, nurses, researchers, data scientists, and informaticians — who advance the use of information and technology to improve health. Standardized vocabularies, interoperability, and clear communication between clinicians and patients are central to our mission.</w:t>
+        <w:t xml:space="preserve">The American Medical Informatics Association (AMIA) writes to support the development and inclusion of a standardized set of medical emoji in the Unicode Standard. AMIA is the professional home for more than [5,500] biomedical and health informatics professionals, including physicians, nurses, researchers, data scientists, and informaticians, who advance the use of information and technology to improve health. Standardized vocabularies, interoperability, and clear communication between clinicians and patients are central to our mission.</w:t>
       </w:r>
     </w:p>
     <w:p>
@@ -71,7 +71,7 @@
         <w:pStyle w:val="BodyText"/>
       </w:pPr>
       <w:r>
-        <w:t xml:space="preserve">Communication in medicine must be clear, accessible, and adaptable across languages, literacy levels, ages, and disabilities. Emoji have become one of the most widely used visual languages in the world, and they are increasingly appearing in patient messages, portal communication, and the clinical record itself — yet the vocabulary available for health and the human body remains limited. Standardized medical emoji are, in informatics terms, a form of controlled clinical iconography: simple, universally rendered visual anchors for common clinical concepts. They would not replace clinical language or professional interpretation. They would add a familiar, globally available, and interoperable communication layer for patient education, discharge instructions, public-health messaging, medical education, and everyday communication between patients and clinicians.</w:t>
+        <w:t xml:space="preserve">Communication in medicine must be clear, accessible, and adaptable across languages, literacy levels, ages, and disabilities. Emoji have become one of the most widely used visual languages in the world, and they are increasingly appearing in patient messages, portal communication, and the clinical record itself, yet the vocabulary available for health and the human body remains limited. Standardized medical emoji are, in informatics terms, a form of controlled clinical iconography: simple, universally rendered visual anchors for common clinical concepts. They would not replace clinical language or professional interpretation. They would add a familiar, globally available, and interoperable communication layer for patient education, discharge instructions, public-health messaging, medical education, and everyday communication between patients and clinicians.</w:t>
       </w:r>
     </w:p>
     <w:p>

</xml_diff>